<commit_message>
Review Class 2 papers, check both classes against syllabus v5.9
- Class 2 per-paper reviews, summary and v3 papers (98 text fixes)
- Generic tools/apply_fixes.py with JSON fix lists per class
- Class 1 v3 rebuilt: required scale disclaimer restored, cover note
  shortened; summary corrected against the syllabus
- Number-line / greyscale check across all 10 papers

Co-Authored-By: Claude Opus 5.5 <noreply@anthropic.com>
Claude-Session: https://claude.ai/code/session_01ABwg7zJ6HxiQEVye1MWpxq
</commit_message>
<xml_diff>
--- a/papers/class1_v3/AMO_C1_L1_PracticePaper1_v3.docx
+++ b/papers/class1_v3/AMO_C1_L1_PracticePaper1_v3.docx
@@ -812,6 +812,29 @@
               <w:t>Do not use a calculator. You may do rough work on a separate sheet.</w:t>
             </w:r>
           </w:p>
+          <w:p>
+            <w:pPr>
+              <w:spacing w:before="0" w:after="40"/>
+              <w:ind w:left="283" w:hanging="227"/>
+            </w:pPr>
+            <w:r>
+              <w:rPr>
+                <w:b/>
+                <w:i w:val="0"/>
+                <w:color w:val="5A2D8F"/>
+                <w:sz w:val="23"/>
+              </w:rPr>
+              <w:t xml:space="preserve">•  </w:t>
+            </w:r>
+            <w:r>
+              <w:rPr>
+                <w:b w:val="0"/>
+                <w:i w:val="0"/>
+                <w:sz w:val="23"/>
+              </w:rPr>
+              <w:t>All figures are not necessarily drawn to scale unless stated.</w:t>
+            </w:r>
+          </w:p>
         </w:tc>
       </w:tr>
     </w:tbl>
@@ -919,7 +942,7 @@
                 <w:i w:val="0"/>
                 <w:sz w:val="21"/>
               </w:rPr>
-              <w:t>The answer sheet and the answer key with solutions are at the end. Give the child the answer sheet. Remove the answer key and solutions before the child begins.</w:t>
+              <w:t>The answer sheet and the answer key are at the end. Remove only the answer key before the child begins.</w:t>
             </w:r>
           </w:p>
         </w:tc>

</xml_diff>